<commit_message>
Conexión a la base de datos mysql
</commit_message>
<xml_diff>
--- a/ADSO-08_EV03_Contextualizacion_Regresion_Lineal.docx
+++ b/ADSO-08_EV03_Contextualizacion_Regresion_Lineal.docx
@@ -22,15 +22,7 @@
         <w:t>regresión lineal</w:t>
       </w:r>
       <w:r>
-        <w:t xml:space="preserve"> es una técnica estadística y de Machine </w:t>
-      </w:r>
-      <w:proofErr w:type="spellStart"/>
-      <w:r>
-        <w:t>Learning</w:t>
-      </w:r>
-      <w:proofErr w:type="spellEnd"/>
-      <w:r>
-        <w:t xml:space="preserve"> que modela la relación lineal entre una variable dependiente y una o más variables independientes mediante el ajuste de una recta (o hiperplano) que minimiza el error cuadrático medio entre las predicciones y los valores reales. </w:t>
+        <w:t xml:space="preserve"> es una técnica estadística y de Machine Learning que modela la relación lineal entre una variable dependiente y una o más variables independientes mediante el ajuste de una recta (o hiperplano) que minimiza el error cuadrático medio entre las predicciones y los valores reales. </w:t>
       </w:r>
     </w:p>
     <w:p>
@@ -104,15 +96,7 @@
         <w:jc w:val="both"/>
       </w:pPr>
       <w:r>
-        <w:t xml:space="preserve">Gracias a la visualización con </w:t>
-      </w:r>
-      <w:proofErr w:type="spellStart"/>
-      <w:r>
-        <w:t>Matplotlib</w:t>
-      </w:r>
-      <w:proofErr w:type="spellEnd"/>
-      <w:r>
-        <w:t>, podemos superponer la línea de regresión sobre la nube de puntos y evaluar de forma intuitiva cómo el modelo captura la tendencia subyacente, a pesar del ruido, y cuantificar su precisión mediante métricas como el MSE y el coeficiente de determinación R².</w:t>
+        <w:t>Gracias a la visualización con Matplotlib, podemos superponer la línea de regresión sobre la nube de puntos y evaluar de forma intuitiva cómo el modelo captura la tendencia subyacente, a pesar del ruido, y cuantificar su precisión mediante métricas como el MSE y el coeficiente de determinación R².</w:t>
       </w:r>
     </w:p>
     <w:p>
@@ -155,23 +139,13 @@
         </w:rPr>
         <w:t xml:space="preserve">Eres analista de datos en Inmobiliaria </w:t>
       </w:r>
-      <w:proofErr w:type="spellStart"/>
       <w:r>
         <w:rPr>
           <w:rFonts w:ascii="Aptos" w:hAnsi="Aptos"/>
           <w:b/>
           <w:bCs/>
         </w:rPr>
-        <w:t>MiCasaYa</w:t>
-      </w:r>
-      <w:proofErr w:type="spellEnd"/>
-      <w:r>
-        <w:rPr>
-          <w:rFonts w:ascii="Aptos" w:hAnsi="Aptos"/>
-          <w:b/>
-          <w:bCs/>
-        </w:rPr>
-        <w:t xml:space="preserve"> S.A.</w:t>
+        <w:t>MiCasaYa S.A.</w:t>
       </w:r>
       <w:r>
         <w:rPr>
@@ -303,16 +277,8 @@
         <w:rPr>
           <w:rFonts w:ascii="Aptos" w:hAnsi="Aptos"/>
         </w:rPr>
-        <w:t xml:space="preserve">Descripción del </w:t>
-      </w:r>
-      <w:proofErr w:type="spellStart"/>
-      <w:r>
-        <w:rPr>
-          <w:rFonts w:ascii="Aptos" w:hAnsi="Aptos"/>
-        </w:rPr>
-        <w:t>dataset</w:t>
-      </w:r>
-      <w:proofErr w:type="spellEnd"/>
+        <w:t>Descripción del dataset</w:t>
+      </w:r>
     </w:p>
     <w:p>
       <w:pPr>
@@ -491,14 +457,12 @@
                 <w:rFonts w:ascii="Aptos" w:hAnsi="Aptos"/>
               </w:rPr>
             </w:pPr>
-            <w:proofErr w:type="spellStart"/>
             <w:r>
               <w:rPr>
                 <w:rFonts w:ascii="Aptos" w:hAnsi="Aptos"/>
               </w:rPr>
               <w:t>area</w:t>
             </w:r>
-            <w:proofErr w:type="spellEnd"/>
           </w:p>
         </w:tc>
         <w:tc>
@@ -649,14 +613,12 @@
                 <w:rFonts w:ascii="Aptos" w:hAnsi="Aptos"/>
               </w:rPr>
             </w:pPr>
-            <w:proofErr w:type="spellStart"/>
             <w:r>
               <w:rPr>
                 <w:rFonts w:ascii="Aptos" w:hAnsi="Aptos"/>
               </w:rPr>
               <w:t>fecha_publicacion</w:t>
             </w:r>
-            <w:proofErr w:type="spellEnd"/>
           </w:p>
         </w:tc>
         <w:tc>
@@ -860,6 +822,46 @@
                 <w:rFonts w:ascii="Aptos" w:hAnsi="Aptos"/>
               </w:rPr>
             </w:pPr>
+            <w:r>
+              <w:rPr>
+                <w:rFonts w:ascii="Aptos" w:hAnsi="Aptos"/>
+              </w:rPr>
+              <w:drawing>
+                <wp:inline distT="0" distB="0" distL="0" distR="0" wp14:anchorId="517B7A24" wp14:editId="090999C3">
+                  <wp:extent cx="5353797" cy="1324160"/>
+                  <wp:effectExtent l="0" t="0" r="0" b="9525"/>
+                  <wp:docPr id="524851055" name="Imagen 1"/>
+                  <wp:cNvGraphicFramePr>
+                    <a:graphicFrameLocks xmlns:a="http://schemas.openxmlformats.org/drawingml/2006/main" noChangeAspect="1"/>
+                  </wp:cNvGraphicFramePr>
+                  <a:graphic xmlns:a="http://schemas.openxmlformats.org/drawingml/2006/main">
+                    <a:graphicData uri="http://schemas.openxmlformats.org/drawingml/2006/picture">
+                      <pic:pic xmlns:pic="http://schemas.openxmlformats.org/drawingml/2006/picture">
+                        <pic:nvPicPr>
+                          <pic:cNvPr id="524851055" name=""/>
+                          <pic:cNvPicPr/>
+                        </pic:nvPicPr>
+                        <pic:blipFill>
+                          <a:blip r:embed="rId13"/>
+                          <a:stretch>
+                            <a:fillRect/>
+                          </a:stretch>
+                        </pic:blipFill>
+                        <pic:spPr>
+                          <a:xfrm>
+                            <a:off x="0" y="0"/>
+                            <a:ext cx="5353797" cy="1324160"/>
+                          </a:xfrm>
+                          <a:prstGeom prst="rect">
+                            <a:avLst/>
+                          </a:prstGeom>
+                        </pic:spPr>
+                      </pic:pic>
+                    </a:graphicData>
+                  </a:graphic>
+                </wp:inline>
+              </w:drawing>
+            </w:r>
           </w:p>
         </w:tc>
       </w:tr>
@@ -889,6 +891,7 @@
         <w:rPr>
           <w:rFonts w:ascii="Aptos" w:hAnsi="Aptos"/>
         </w:rPr>
+        <w:lastRenderedPageBreak/>
         <w:t>Crear y mostrar</w:t>
       </w:r>
       <w:r>
@@ -943,14 +946,12 @@
         </w:rPr>
         <w:t>(</w:t>
       </w:r>
-      <w:proofErr w:type="spellStart"/>
       <w:r>
         <w:rPr>
           <w:rFonts w:ascii="Aptos" w:hAnsi="Aptos"/>
         </w:rPr>
         <w:t>tabulate</w:t>
       </w:r>
-      <w:proofErr w:type="spellEnd"/>
       <w:r>
         <w:rPr>
           <w:rFonts w:ascii="Aptos" w:hAnsi="Aptos"/>
@@ -1033,6 +1034,172 @@
                 <w:rFonts w:ascii="Aptos" w:hAnsi="Aptos"/>
               </w:rPr>
             </w:pPr>
+            <w:r>
+              <w:rPr>
+                <w:rFonts w:ascii="Aptos" w:hAnsi="Aptos"/>
+              </w:rPr>
+              <w:drawing>
+                <wp:inline distT="0" distB="0" distL="0" distR="0" wp14:anchorId="08B815DC" wp14:editId="192B41E9">
+                  <wp:extent cx="5971540" cy="4716145"/>
+                  <wp:effectExtent l="0" t="0" r="0" b="8255"/>
+                  <wp:docPr id="2074355658" name="Imagen 1"/>
+                  <wp:cNvGraphicFramePr>
+                    <a:graphicFrameLocks xmlns:a="http://schemas.openxmlformats.org/drawingml/2006/main" noChangeAspect="1"/>
+                  </wp:cNvGraphicFramePr>
+                  <a:graphic xmlns:a="http://schemas.openxmlformats.org/drawingml/2006/main">
+                    <a:graphicData uri="http://schemas.openxmlformats.org/drawingml/2006/picture">
+                      <pic:pic xmlns:pic="http://schemas.openxmlformats.org/drawingml/2006/picture">
+                        <pic:nvPicPr>
+                          <pic:cNvPr id="2074355658" name=""/>
+                          <pic:cNvPicPr/>
+                        </pic:nvPicPr>
+                        <pic:blipFill>
+                          <a:blip r:embed="rId14"/>
+                          <a:stretch>
+                            <a:fillRect/>
+                          </a:stretch>
+                        </pic:blipFill>
+                        <pic:spPr>
+                          <a:xfrm>
+                            <a:off x="0" y="0"/>
+                            <a:ext cx="5971540" cy="4716145"/>
+                          </a:xfrm>
+                          <a:prstGeom prst="rect">
+                            <a:avLst/>
+                          </a:prstGeom>
+                        </pic:spPr>
+                      </pic:pic>
+                    </a:graphicData>
+                  </a:graphic>
+                </wp:inline>
+              </w:drawing>
+            </w:r>
+          </w:p>
+          <w:p>
+            <w:pPr>
+              <w:pStyle w:val="Prrafodelista"/>
+              <w:ind w:left="0"/>
+              <w:rPr>
+                <w:rFonts w:ascii="Aptos" w:hAnsi="Aptos"/>
+              </w:rPr>
+            </w:pPr>
+          </w:p>
+          <w:p>
+            <w:pPr>
+              <w:pStyle w:val="Prrafodelista"/>
+              <w:ind w:left="0"/>
+              <w:rPr>
+                <w:rFonts w:ascii="Aptos" w:hAnsi="Aptos"/>
+              </w:rPr>
+            </w:pPr>
+            <w:r>
+              <w:rPr>
+                <w:rFonts w:ascii="Aptos" w:hAnsi="Aptos"/>
+              </w:rPr>
+              <w:t>Los datos obtenidos fueron:</w:t>
+            </w:r>
+          </w:p>
+          <w:p>
+            <w:pPr>
+              <w:pStyle w:val="Prrafodelista"/>
+              <w:ind w:left="0"/>
+              <w:rPr>
+                <w:rFonts w:ascii="Aptos" w:hAnsi="Aptos"/>
+              </w:rPr>
+            </w:pPr>
+            <w:r>
+              <w:rPr>
+                <w:rFonts w:ascii="Aptos" w:hAnsi="Aptos"/>
+              </w:rPr>
+              <w:t>Precio – en pesos colombianos</w:t>
+            </w:r>
+          </w:p>
+          <w:p>
+            <w:pPr>
+              <w:pStyle w:val="Prrafodelista"/>
+              <w:ind w:left="0"/>
+              <w:rPr>
+                <w:rFonts w:ascii="Aptos" w:hAnsi="Aptos"/>
+              </w:rPr>
+            </w:pPr>
+            <w:r>
+              <w:rPr>
+                <w:rFonts w:ascii="Aptos" w:hAnsi="Aptos"/>
+              </w:rPr>
+              <w:t>Área – en metros cuadrados</w:t>
+            </w:r>
+          </w:p>
+          <w:p>
+            <w:pPr>
+              <w:pStyle w:val="Prrafodelista"/>
+              <w:ind w:left="0"/>
+              <w:rPr>
+                <w:rFonts w:ascii="Aptos" w:hAnsi="Aptos"/>
+              </w:rPr>
+            </w:pPr>
+            <w:r>
+              <w:rPr>
+                <w:rFonts w:ascii="Aptos" w:hAnsi="Aptos"/>
+              </w:rPr>
+              <w:t>Habitaciones</w:t>
+            </w:r>
+          </w:p>
+          <w:p>
+            <w:pPr>
+              <w:pStyle w:val="Prrafodelista"/>
+              <w:ind w:left="0"/>
+              <w:rPr>
+                <w:rFonts w:ascii="Aptos" w:hAnsi="Aptos"/>
+              </w:rPr>
+            </w:pPr>
+            <w:r>
+              <w:rPr>
+                <w:rFonts w:ascii="Aptos" w:hAnsi="Aptos"/>
+              </w:rPr>
+              <w:t xml:space="preserve">Antigüedad – </w:t>
+            </w:r>
+            <w:r>
+              <w:rPr>
+                <w:rFonts w:ascii="Aptos" w:hAnsi="Aptos"/>
+              </w:rPr>
+              <w:t>Años que pasaron</w:t>
+            </w:r>
+            <w:r>
+              <w:rPr>
+                <w:rFonts w:ascii="Aptos" w:hAnsi="Aptos"/>
+              </w:rPr>
+              <w:t xml:space="preserve"> en la que fue construida la casa</w:t>
+            </w:r>
+          </w:p>
+          <w:p>
+            <w:pPr>
+              <w:pStyle w:val="Prrafodelista"/>
+              <w:ind w:left="0"/>
+              <w:rPr>
+                <w:rFonts w:ascii="Aptos" w:hAnsi="Aptos"/>
+              </w:rPr>
+            </w:pPr>
+            <w:r>
+              <w:rPr>
+                <w:rFonts w:ascii="Aptos" w:hAnsi="Aptos"/>
+              </w:rPr>
+              <w:t>Fecha de publicación – Fecha en la que fue publicada la casa para la venta</w:t>
+            </w:r>
+          </w:p>
+          <w:p>
+            <w:pPr>
+              <w:pStyle w:val="Prrafodelista"/>
+              <w:ind w:left="0"/>
+              <w:rPr>
+                <w:rFonts w:ascii="Aptos" w:hAnsi="Aptos"/>
+              </w:rPr>
+            </w:pPr>
+            <w:r>
+              <w:rPr>
+                <w:rFonts w:ascii="Aptos" w:hAnsi="Aptos"/>
+              </w:rPr>
+              <w:t>Descripción</w:t>
+            </w:r>
           </w:p>
         </w:tc>
       </w:tr>
@@ -1415,7 +1582,6 @@
         </w:rPr>
         <w:t xml:space="preserve">Usando </w:t>
       </w:r>
-      <w:proofErr w:type="spellStart"/>
       <w:r>
         <w:rPr>
           <w:rFonts w:ascii="Aptos" w:hAnsi="Aptos"/>
@@ -1424,7 +1590,6 @@
         </w:rPr>
         <w:t>scikit-learn</w:t>
       </w:r>
-      <w:proofErr w:type="spellEnd"/>
       <w:r>
         <w:rPr>
           <w:rFonts w:ascii="Aptos" w:hAnsi="Aptos"/>
@@ -1638,11 +1803,11 @@
       </w:r>
     </w:p>
     <w:sectPr>
-      <w:headerReference w:type="even" r:id="rId13"/>
-      <w:headerReference w:type="default" r:id="rId14"/>
-      <w:footerReference w:type="default" r:id="rId15"/>
-      <w:headerReference w:type="first" r:id="rId16"/>
-      <w:footerReference w:type="first" r:id="rId17"/>
+      <w:headerReference w:type="even" r:id="rId15"/>
+      <w:headerReference w:type="default" r:id="rId16"/>
+      <w:footerReference w:type="default" r:id="rId17"/>
+      <w:headerReference w:type="first" r:id="rId18"/>
+      <w:footerReference w:type="first" r:id="rId19"/>
       <w:pgSz w:w="12240" w:h="15840" w:code="1"/>
       <w:pgMar w:top="1418" w:right="1418" w:bottom="1418" w:left="1418" w:header="709" w:footer="397" w:gutter="0"/>
       <w:pgBorders w:offsetFrom="page">
@@ -1730,59 +1895,13 @@
               <w:szCs w:val="20"/>
             </w:rPr>
           </w:pPr>
-          <w:proofErr w:type="spellStart"/>
           <w:r>
             <w:rPr>
               <w:rFonts w:asciiTheme="minorHAnsi" w:hAnsiTheme="minorHAnsi" w:cstheme="minorBidi"/>
               <w:sz w:val="20"/>
               <w:szCs w:val="20"/>
             </w:rPr>
-            <w:t>Jhon</w:t>
-          </w:r>
-          <w:proofErr w:type="spellEnd"/>
-          <w:r>
-            <w:rPr>
-              <w:rFonts w:asciiTheme="minorHAnsi" w:hAnsiTheme="minorHAnsi" w:cstheme="minorBidi"/>
-              <w:sz w:val="20"/>
-              <w:szCs w:val="20"/>
-            </w:rPr>
-            <w:t xml:space="preserve"> </w:t>
-          </w:r>
-          <w:proofErr w:type="spellStart"/>
-          <w:r>
-            <w:rPr>
-              <w:rFonts w:asciiTheme="minorHAnsi" w:hAnsiTheme="minorHAnsi" w:cstheme="minorBidi"/>
-              <w:sz w:val="20"/>
-              <w:szCs w:val="20"/>
-            </w:rPr>
-            <w:t>Hader</w:t>
-          </w:r>
-          <w:proofErr w:type="spellEnd"/>
-          <w:r>
-            <w:rPr>
-              <w:rFonts w:asciiTheme="minorHAnsi" w:hAnsiTheme="minorHAnsi" w:cstheme="minorBidi"/>
-              <w:sz w:val="20"/>
-              <w:szCs w:val="20"/>
-            </w:rPr>
-            <w:t xml:space="preserve"> </w:t>
-          </w:r>
-          <w:proofErr w:type="spellStart"/>
-          <w:r>
-            <w:rPr>
-              <w:rFonts w:asciiTheme="minorHAnsi" w:hAnsiTheme="minorHAnsi" w:cstheme="minorBidi"/>
-              <w:sz w:val="20"/>
-              <w:szCs w:val="20"/>
-            </w:rPr>
-            <w:t>Rodriguez</w:t>
-          </w:r>
-          <w:proofErr w:type="spellEnd"/>
-          <w:r>
-            <w:rPr>
-              <w:rFonts w:asciiTheme="minorHAnsi" w:hAnsiTheme="minorHAnsi" w:cstheme="minorBidi"/>
-              <w:sz w:val="20"/>
-              <w:szCs w:val="20"/>
-            </w:rPr>
-            <w:t xml:space="preserve"> Perdomo</w:t>
+            <w:t>Jhon Hader Rodriguez Perdomo</w:t>
           </w:r>
         </w:p>
         <w:p>
@@ -4885,15 +5004,21 @@
 </file>
 
 <file path=customXml/item1.xml><?xml version="1.0" encoding="utf-8"?>
-<?mso-contentType ?>
-<FormTemplates xmlns="http://schemas.microsoft.com/sharepoint/v3/contenttype/forms">
-  <Display>DocumentLibraryForm</Display>
-  <Edit>DocumentLibraryForm</Edit>
-  <New>DocumentLibraryForm</New>
-</FormTemplates>
+<b:Sources xmlns:b="http://schemas.openxmlformats.org/officeDocument/2006/bibliography" xmlns="http://schemas.openxmlformats.org/officeDocument/2006/bibliography" SelectedStyle="\APA.XSL" StyleName="APA"/>
 </file>
 
 <file path=customXml/item2.xml><?xml version="1.0" encoding="utf-8"?>
+<p:properties xmlns:p="http://schemas.microsoft.com/office/2006/metadata/properties" xmlns:xsi="http://www.w3.org/2001/XMLSchema-instance" xmlns:pc="http://schemas.microsoft.com/office/infopath/2007/PartnerControls">
+  <documentManagement>
+    <lcf76f155ced4ddcb4097134ff3c332f xmlns="8db2478a-a40b-4982-825e-cde4312e2ff3">
+      <Terms xmlns="http://schemas.microsoft.com/office/infopath/2007/PartnerControls"/>
+    </lcf76f155ced4ddcb4097134ff3c332f>
+    <TaxCatchAll xmlns="3b6dcaca-4780-467b-b912-dbe4b814165f" xsi:nil="true"/>
+  </documentManagement>
+</p:properties>
+</file>
+
+<file path=customXml/item3.xml><?xml version="1.0" encoding="utf-8"?>
 <ct:contentTypeSchema xmlns:ct="http://schemas.microsoft.com/office/2006/metadata/contentType" xmlns:ma="http://schemas.microsoft.com/office/2006/metadata/properties/metaAttributes" ct:_="" ma:_="" ma:contentTypeName="Document" ma:contentTypeID="0x010100926CA4D76510EA419F4BE725BF7B63E3" ma:contentTypeVersion="12" ma:contentTypeDescription="Create a new document." ma:contentTypeScope="" ma:versionID="0cdff4e03d54616d45c83efa1d34b286">
   <xsd:schema xmlns:xsd="http://www.w3.org/2001/XMLSchema" xmlns:xs="http://www.w3.org/2001/XMLSchema" xmlns:p="http://schemas.microsoft.com/office/2006/metadata/properties" xmlns:ns2="8db2478a-a40b-4982-825e-cde4312e2ff3" xmlns:ns3="3b6dcaca-4780-467b-b912-dbe4b814165f" targetNamespace="http://schemas.microsoft.com/office/2006/metadata/properties" ma:root="true" ma:fieldsID="724de33db86d69b02ea02859a9000f62" ns2:_="" ns3:_="">
     <xsd:import namespace="8db2478a-a40b-4982-825e-cde4312e2ff3"/>
@@ -5094,30 +5219,35 @@
 </ct:contentTypeSchema>
 </file>
 
-<file path=customXml/item3.xml><?xml version="1.0" encoding="utf-8"?>
-<p:properties xmlns:p="http://schemas.microsoft.com/office/2006/metadata/properties" xmlns:xsi="http://www.w3.org/2001/XMLSchema-instance" xmlns:pc="http://schemas.microsoft.com/office/infopath/2007/PartnerControls">
-  <documentManagement>
-    <lcf76f155ced4ddcb4097134ff3c332f xmlns="8db2478a-a40b-4982-825e-cde4312e2ff3">
-      <Terms xmlns="http://schemas.microsoft.com/office/infopath/2007/PartnerControls"/>
-    </lcf76f155ced4ddcb4097134ff3c332f>
-    <TaxCatchAll xmlns="3b6dcaca-4780-467b-b912-dbe4b814165f" xsi:nil="true"/>
-  </documentManagement>
-</p:properties>
-</file>
-
 <file path=customXml/item4.xml><?xml version="1.0" encoding="utf-8"?>
-<b:Sources xmlns:b="http://schemas.openxmlformats.org/officeDocument/2006/bibliography" xmlns="http://schemas.openxmlformats.org/officeDocument/2006/bibliography" SelectedStyle="\APA.XSL" StyleName="APA"/>
+<?mso-contentType ?>
+<FormTemplates xmlns="http://schemas.microsoft.com/sharepoint/v3/contenttype/forms">
+  <Display>DocumentLibraryForm</Display>
+  <Edit>DocumentLibraryForm</Edit>
+  <New>DocumentLibraryForm</New>
+</FormTemplates>
 </file>
 
 <file path=customXml/itemProps1.xml><?xml version="1.0" encoding="utf-8"?>
-<ds:datastoreItem xmlns:ds="http://schemas.openxmlformats.org/officeDocument/2006/customXml" ds:itemID="{2A7E7665-CF73-4DD1-976E-C4A31BF5A359}">
+<ds:datastoreItem xmlns:ds="http://schemas.openxmlformats.org/officeDocument/2006/customXml" ds:itemID="{3AA41AF0-5A0C-4F5C-82A5-7890DA08B4DB}">
   <ds:schemaRefs>
-    <ds:schemaRef ds:uri="http://schemas.microsoft.com/sharepoint/v3/contenttype/forms"/>
+    <ds:schemaRef ds:uri="http://schemas.openxmlformats.org/officeDocument/2006/bibliography"/>
   </ds:schemaRefs>
 </ds:datastoreItem>
 </file>
 
 <file path=customXml/itemProps2.xml><?xml version="1.0" encoding="utf-8"?>
+<ds:datastoreItem xmlns:ds="http://schemas.openxmlformats.org/officeDocument/2006/customXml" ds:itemID="{46FA7E23-3453-4ABC-B383-0666A32183EC}">
+  <ds:schemaRefs>
+    <ds:schemaRef ds:uri="http://schemas.microsoft.com/office/2006/metadata/properties"/>
+    <ds:schemaRef ds:uri="http://schemas.microsoft.com/office/infopath/2007/PartnerControls"/>
+    <ds:schemaRef ds:uri="8db2478a-a40b-4982-825e-cde4312e2ff3"/>
+    <ds:schemaRef ds:uri="3b6dcaca-4780-467b-b912-dbe4b814165f"/>
+  </ds:schemaRefs>
+</ds:datastoreItem>
+</file>
+
+<file path=customXml/itemProps3.xml><?xml version="1.0" encoding="utf-8"?>
 <ds:datastoreItem xmlns:ds="http://schemas.openxmlformats.org/officeDocument/2006/customXml" ds:itemID="{096ACC53-B88E-4919-9FB1-2A80DDFC9B52}">
   <ds:schemaRefs>
     <ds:schemaRef ds:uri="http://schemas.microsoft.com/office/2006/metadata/contentType"/>
@@ -5136,21 +5266,10 @@
 </ds:datastoreItem>
 </file>
 
-<file path=customXml/itemProps3.xml><?xml version="1.0" encoding="utf-8"?>
-<ds:datastoreItem xmlns:ds="http://schemas.openxmlformats.org/officeDocument/2006/customXml" ds:itemID="{46FA7E23-3453-4ABC-B383-0666A32183EC}">
+<file path=customXml/itemProps4.xml><?xml version="1.0" encoding="utf-8"?>
+<ds:datastoreItem xmlns:ds="http://schemas.openxmlformats.org/officeDocument/2006/customXml" ds:itemID="{2A7E7665-CF73-4DD1-976E-C4A31BF5A359}">
   <ds:schemaRefs>
-    <ds:schemaRef ds:uri="http://schemas.microsoft.com/office/2006/metadata/properties"/>
-    <ds:schemaRef ds:uri="http://schemas.microsoft.com/office/infopath/2007/PartnerControls"/>
-    <ds:schemaRef ds:uri="8db2478a-a40b-4982-825e-cde4312e2ff3"/>
-    <ds:schemaRef ds:uri="3b6dcaca-4780-467b-b912-dbe4b814165f"/>
-  </ds:schemaRefs>
-</ds:datastoreItem>
-</file>
-
-<file path=customXml/itemProps4.xml><?xml version="1.0" encoding="utf-8"?>
-<ds:datastoreItem xmlns:ds="http://schemas.openxmlformats.org/officeDocument/2006/customXml" ds:itemID="{3AA41AF0-5A0C-4F5C-82A5-7890DA08B4DB}">
-  <ds:schemaRefs>
-    <ds:schemaRef ds:uri="http://schemas.openxmlformats.org/officeDocument/2006/bibliography"/>
+    <ds:schemaRef ds:uri="http://schemas.microsoft.com/sharepoint/v3/contenttype/forms"/>
   </ds:schemaRefs>
 </ds:datastoreItem>
 </file>
</xml_diff>